<commit_message>
changed manuscript template to fit APA
</commit_message>
<xml_diff>
--- a/content/resources/how-to/write-a-manuscript/manuscript-template.docx
+++ b/content/resources/how-to/write-a-manuscript/manuscript-template.docx
@@ -55,6 +55,9 @@
       <w:r>
         <w:rPr>
           <w:rStyle w:val="CommentReference"/>
+          <w:color w:val="auto"/>
+          <w:sz w:val="36"/>
+          <w:szCs w:val="34"/>
         </w:rPr>
         <w:commentReference w:id="1"/>
       </w:r>
@@ -90,6 +93,10 @@
       <w:r>
         <w:rPr>
           <w:rStyle w:val="CommentReference"/>
+          <w:color w:val="auto"/>
+          <w:sz w:val="28"/>
+          <w:szCs w:val="26"/>
+          <w:vertAlign w:val="superscript"/>
         </w:rPr>
         <w:commentReference w:id="2"/>
       </w:r>
@@ -403,6 +410,9 @@
         <w:rPr>
           <w:rStyle w:val="CommentReference"/>
           <w:b/>
+          <w:color w:val="auto"/>
+          <w:sz w:val="24"/>
+          <w:szCs w:val="22"/>
         </w:rPr>
         <w:commentReference w:id="3"/>
       </w:r>
@@ -518,6 +528,9 @@
         <w:rPr>
           <w:rStyle w:val="CommentReference"/>
           <w:b/>
+          <w:color w:val="auto"/>
+          <w:sz w:val="24"/>
+          <w:szCs w:val="22"/>
         </w:rPr>
         <w:commentReference w:id="4"/>
       </w:r>
@@ -568,7 +581,7 @@
           <w:sz w:val="24"/>
           <w:szCs w:val="22"/>
         </w:rPr>
-        <w:t>1592</w:t>
+        <w:t>1619</w:t>
       </w:r>
       <w:r>
         <w:rPr>
@@ -797,7 +810,9 @@
       <w:r>
         <w:rPr>
           <w:rStyle w:val="CommentReference"/>
-          <w:b w:val="0"/>
+          <w:color w:val="auto"/>
+          <w:sz w:val="24"/>
+          <w:szCs w:val="22"/>
         </w:rPr>
         <w:commentReference w:id="6"/>
       </w:r>
@@ -1037,7 +1052,11 @@
       <w:r>
         <w:rPr>
           <w:rStyle w:val="CommentReference"/>
+          <w:b/>
           <w:i w:val="0"/>
+          <w:color w:val="auto"/>
+          <w:sz w:val="24"/>
+          <w:szCs w:val="24"/>
         </w:rPr>
         <w:commentReference w:id="7"/>
       </w:r>
@@ -1067,7 +1086,10 @@
       <w:r>
         <w:rPr>
           <w:rStyle w:val="CommentReference"/>
-          <w:b w:val="0"/>
+          <w:i/>
+          <w:color w:val="auto"/>
+          <w:sz w:val="24"/>
+          <w:szCs w:val="24"/>
         </w:rPr>
         <w:commentReference w:id="8"/>
       </w:r>
@@ -1581,6 +1603,9 @@
       <w:r>
         <w:rPr>
           <w:rStyle w:val="CommentReference"/>
+          <w:color w:val="auto"/>
+          <w:sz w:val="24"/>
+          <w:szCs w:val="24"/>
         </w:rPr>
         <w:commentReference w:id="9"/>
       </w:r>
@@ -1599,6 +1624,14 @@
           <w:szCs w:val="24"/>
         </w:rPr>
         <w:t>.</w:t>
+      </w:r>
+      <w:r>
+        <w:rPr>
+          <w:color w:val="auto"/>
+          <w:sz w:val="24"/>
+          <w:szCs w:val="24"/>
+        </w:rPr>
+        <w:t xml:space="preserve"> Figure/table titles are presented above the figure/table, with a note (caption) below it.</w:t>
       </w:r>
     </w:p>
     <w:p>
@@ -1611,6 +1644,121 @@
           <w:szCs w:val="24"/>
         </w:rPr>
       </w:pPr>
+    </w:p>
+    <w:p>
+      <w:pPr>
+        <w:spacing w:line="480" w:lineRule="auto"/>
+        <w:jc w:val="both"/>
+        <w:rPr>
+          <w:color w:val="auto"/>
+          <w:sz w:val="24"/>
+          <w:szCs w:val="24"/>
+        </w:rPr>
+      </w:pPr>
+      <w:bookmarkStart w:id="10" w:name="_Ref68701532"/>
+      <w:commentRangeStart w:id="11"/>
+      <w:r>
+        <w:rPr>
+          <w:b/>
+          <w:color w:val="auto"/>
+          <w:sz w:val="22"/>
+          <w:szCs w:val="24"/>
+          <w:lang w:val="en-GB"/>
+        </w:rPr>
+        <w:t xml:space="preserve">Figure </w:t>
+      </w:r>
+      <w:r>
+        <w:rPr>
+          <w:b/>
+          <w:color w:val="auto"/>
+          <w:sz w:val="22"/>
+          <w:szCs w:val="24"/>
+          <w:lang w:val="en-GB"/>
+        </w:rPr>
+        <w:fldChar w:fldCharType="begin"/>
+      </w:r>
+      <w:r>
+        <w:rPr>
+          <w:b/>
+          <w:color w:val="auto"/>
+          <w:sz w:val="22"/>
+          <w:szCs w:val="24"/>
+          <w:lang w:val="en-GB"/>
+        </w:rPr>
+        <w:instrText xml:space="preserve"> SEQ Figure \* ARABIC </w:instrText>
+      </w:r>
+      <w:r>
+        <w:rPr>
+          <w:b/>
+          <w:color w:val="auto"/>
+          <w:sz w:val="22"/>
+          <w:szCs w:val="24"/>
+          <w:lang w:val="en-GB"/>
+        </w:rPr>
+        <w:fldChar w:fldCharType="separate"/>
+      </w:r>
+      <w:r>
+        <w:rPr>
+          <w:b/>
+          <w:noProof/>
+          <w:color w:val="auto"/>
+          <w:sz w:val="22"/>
+          <w:szCs w:val="24"/>
+          <w:lang w:val="en-GB"/>
+        </w:rPr>
+        <w:t>1</w:t>
+      </w:r>
+      <w:r>
+        <w:rPr>
+          <w:color w:val="auto"/>
+          <w:sz w:val="22"/>
+          <w:szCs w:val="24"/>
+        </w:rPr>
+        <w:fldChar w:fldCharType="end"/>
+      </w:r>
+      <w:bookmarkEnd w:id="10"/>
+      <w:r>
+        <w:rPr>
+          <w:b/>
+          <w:color w:val="auto"/>
+          <w:sz w:val="22"/>
+          <w:szCs w:val="24"/>
+          <w:lang w:val="en-GB"/>
+        </w:rPr>
+        <w:t xml:space="preserve">. </w:t>
+      </w:r>
+      <w:r>
+        <w:rPr>
+          <w:b/>
+          <w:color w:val="auto"/>
+          <w:sz w:val="22"/>
+          <w:szCs w:val="24"/>
+          <w:lang w:val="en-GB"/>
+        </w:rPr>
+        <w:t xml:space="preserve">Example </w:t>
+      </w:r>
+      <w:commentRangeEnd w:id="11"/>
+      <w:r>
+        <w:rPr>
+          <w:rStyle w:val="CommentReference"/>
+          <w:b/>
+          <w:color w:val="auto"/>
+          <w:sz w:val="22"/>
+          <w:szCs w:val="24"/>
+          <w:lang w:val="en-GB"/>
+        </w:rPr>
+        <w:commentReference w:id="11"/>
+      </w:r>
+      <w:r>
+        <w:rPr>
+          <w:b/>
+          <w:color w:val="auto"/>
+          <w:sz w:val="22"/>
+          <w:szCs w:val="24"/>
+          <w:lang w:val="en-GB"/>
+        </w:rPr>
+        <w:t>stimuli from Experiment 1.</w:t>
+      </w:r>
     </w:p>
     <w:p>
       <w:pPr>
@@ -1700,59 +1848,48 @@
           <w:szCs w:val="24"/>
         </w:rPr>
       </w:pPr>
-      <w:bookmarkStart w:id="10" w:name="_Ref68701532"/>
-      <w:bookmarkStart w:id="11" w:name="_Toc109469368"/>
-      <w:commentRangeStart w:id="12"/>
-      <w:r>
-        <w:rPr>
-          <w:b/>
+      <w:bookmarkStart w:id="12" w:name="_Toc109469368"/>
+      <w:r>
+        <w:rPr>
+          <w:i/>
+          <w:iCs/>
           <w:color w:val="auto"/>
           <w:sz w:val="22"/>
           <w:szCs w:val="24"/>
-          <w:lang w:val="en-GB"/>
-        </w:rPr>
-        <w:t xml:space="preserve">Figure </w:t>
-      </w:r>
-      <w:r>
-        <w:rPr>
-          <w:b/>
+        </w:rPr>
+        <w:t xml:space="preserve">Note. </w:t>
+      </w:r>
+      <w:r>
+        <w:rPr>
           <w:color w:val="auto"/>
           <w:sz w:val="22"/>
           <w:szCs w:val="24"/>
-          <w:lang w:val="en-GB"/>
-        </w:rPr>
-        <w:fldChar w:fldCharType="begin"/>
-      </w:r>
-      <w:r>
-        <w:rPr>
-          <w:b/>
+        </w:rPr>
+        <w:t xml:space="preserve">The longer </w:t>
+      </w:r>
+      <w:r>
+        <w:rPr>
           <w:color w:val="auto"/>
           <w:sz w:val="22"/>
           <w:szCs w:val="24"/>
-          <w:lang w:val="en-GB"/>
-        </w:rPr>
-        <w:instrText xml:space="preserve"> SEQ Figure \* ARABIC </w:instrText>
-      </w:r>
-      <w:r>
-        <w:rPr>
-          <w:b/>
+        </w:rPr>
+        <w:t>a figure’s note/</w:t>
+      </w:r>
+      <w:r>
+        <w:rPr>
           <w:color w:val="auto"/>
           <w:sz w:val="22"/>
           <w:szCs w:val="24"/>
-          <w:lang w:val="en-GB"/>
-        </w:rPr>
-        <w:fldChar w:fldCharType="separate"/>
-      </w:r>
-      <w:r>
-        <w:rPr>
-          <w:b/>
-          <w:noProof/>
+        </w:rPr>
+        <w:t>caption, the better</w:t>
+      </w:r>
+      <w:r>
+        <w:rPr>
           <w:color w:val="auto"/>
           <w:sz w:val="22"/>
           <w:szCs w:val="24"/>
-          <w:lang w:val="en-GB"/>
-        </w:rPr>
-        <w:t>1</w:t>
+        </w:rPr>
+        <w:t>, in my view</w:t>
       </w:r>
       <w:r>
         <w:rPr>
@@ -1760,71 +1897,9 @@
           <w:sz w:val="22"/>
           <w:szCs w:val="24"/>
         </w:rPr>
-        <w:fldChar w:fldCharType="end"/>
-      </w:r>
-      <w:bookmarkEnd w:id="10"/>
-      <w:r>
-        <w:rPr>
-          <w:b/>
-          <w:color w:val="auto"/>
-          <w:sz w:val="22"/>
-          <w:szCs w:val="24"/>
-          <w:lang w:val="en-GB"/>
-        </w:rPr>
-        <w:t xml:space="preserve">. </w:t>
-      </w:r>
-      <w:r>
-        <w:rPr>
-          <w:b/>
-          <w:color w:val="auto"/>
-          <w:sz w:val="22"/>
-          <w:szCs w:val="24"/>
-          <w:lang w:val="en-GB"/>
-        </w:rPr>
-        <w:t xml:space="preserve">Example </w:t>
-      </w:r>
-      <w:commentRangeEnd w:id="12"/>
-      <w:r>
-        <w:rPr>
-          <w:rStyle w:val="CommentReference"/>
-        </w:rPr>
-        <w:commentReference w:id="12"/>
-      </w:r>
-      <w:r>
-        <w:rPr>
-          <w:b/>
-          <w:color w:val="auto"/>
-          <w:sz w:val="22"/>
-          <w:szCs w:val="24"/>
-          <w:lang w:val="en-GB"/>
-        </w:rPr>
-        <w:t xml:space="preserve">stimuli from Experiment 1. </w:t>
-      </w:r>
-      <w:r>
-        <w:rPr>
-          <w:color w:val="auto"/>
-          <w:sz w:val="22"/>
-          <w:szCs w:val="24"/>
-        </w:rPr>
-        <w:t xml:space="preserve">Captions have a title in bold, followed by further details. </w:t>
-      </w:r>
-      <w:r>
-        <w:rPr>
-          <w:color w:val="auto"/>
-          <w:sz w:val="22"/>
-          <w:szCs w:val="24"/>
-        </w:rPr>
-        <w:t xml:space="preserve">Figure captions go below the figure. </w:t>
-      </w:r>
-      <w:r>
-        <w:rPr>
-          <w:color w:val="auto"/>
-          <w:sz w:val="22"/>
-          <w:szCs w:val="24"/>
-        </w:rPr>
-        <w:t>The longer the caption, the better. Ideally, readers should be able to understand the study design and outcomes by scanning the figures and captions alone. Also make sure to explain all details seen in the figure, such as color coding, line types, etc.</w:t>
-      </w:r>
-      <w:bookmarkEnd w:id="11"/>
+        <w:t>. Ideally, readers should be able to understand the study design and outcomes by scanning the figures and captions alone. Also make sure to explain all details seen in the figure, such as color coding, line types, etc.</w:t>
+      </w:r>
+      <w:bookmarkEnd w:id="12"/>
     </w:p>
     <w:p>
       <w:pPr>
@@ -2072,51 +2147,6 @@
           <w:szCs w:val="22"/>
         </w:rPr>
         <w:t>.</w:t>
-      </w:r>
-      <w:r>
-        <w:rPr>
-          <w:iCs/>
-          <w:color w:val="auto"/>
-          <w:sz w:val="22"/>
-          <w:szCs w:val="22"/>
-        </w:rPr>
-        <w:t xml:space="preserve"> </w:t>
-      </w:r>
-      <w:r>
-        <w:rPr>
-          <w:iCs/>
-          <w:color w:val="auto"/>
-          <w:sz w:val="22"/>
-          <w:szCs w:val="22"/>
-        </w:rPr>
-        <w:t xml:space="preserve">Table captions also have a title in bold followed by more details. Table captions go above the table itself. Tables themselves are center-aligned following APA guidelines. There are no visible boundaries, except for a horizontal line between header and first row, and below the last row. </w:t>
-      </w:r>
-      <w:r>
-        <w:rPr>
-          <w:iCs/>
-          <w:color w:val="auto"/>
-          <w:sz w:val="22"/>
-          <w:szCs w:val="22"/>
-        </w:rPr>
-        <w:t xml:space="preserve">Number the rows if you need to refer to individual rows in the text. </w:t>
-      </w:r>
-      <w:r>
-        <w:rPr>
-          <w:iCs/>
-          <w:color w:val="auto"/>
-          <w:sz w:val="22"/>
-          <w:szCs w:val="22"/>
-        </w:rPr>
-        <w:t xml:space="preserve">Write out abbreviations in full. </w:t>
-      </w:r>
-      <w:r>
-        <w:rPr>
-          <w:iCs/>
-          <w:color w:val="auto"/>
-          <w:sz w:val="22"/>
-          <w:szCs w:val="22"/>
-        </w:rPr>
-        <w:t>TSR = Token Sort Ratio.</w:t>
       </w:r>
     </w:p>
     <w:tbl>
@@ -2612,6 +2642,46 @@
         <w:spacing w:line="480" w:lineRule="auto"/>
         <w:jc w:val="both"/>
         <w:rPr>
+          <w:iCs/>
+          <w:color w:val="auto"/>
+          <w:sz w:val="22"/>
+          <w:szCs w:val="22"/>
+        </w:rPr>
+      </w:pPr>
+      <w:r>
+        <w:rPr>
+          <w:i/>
+          <w:iCs/>
+          <w:color w:val="auto"/>
+          <w:sz w:val="24"/>
+          <w:szCs w:val="24"/>
+        </w:rPr>
+        <w:t xml:space="preserve">Note. </w:t>
+      </w:r>
+      <w:r>
+        <w:rPr>
+          <w:iCs/>
+          <w:color w:val="auto"/>
+          <w:sz w:val="22"/>
+          <w:szCs w:val="22"/>
+        </w:rPr>
+        <w:t xml:space="preserve">Tables are center-aligned following APA guidelines. There are no visible boundaries, except for a horizontal line between header and first row, and below the last row. Number the rows if you need to refer to individual rows in the text. Write out abbreviations in full. </w:t>
+      </w:r>
+      <w:r>
+        <w:rPr>
+          <w:iCs/>
+          <w:color w:val="auto"/>
+          <w:sz w:val="22"/>
+          <w:szCs w:val="22"/>
+        </w:rPr>
+        <w:t>TSR = Token Sort Ratio.</w:t>
+      </w:r>
+    </w:p>
+    <w:p>
+      <w:pPr>
+        <w:spacing w:line="480" w:lineRule="auto"/>
+        <w:jc w:val="both"/>
+        <w:rPr>
           <w:color w:val="auto"/>
           <w:sz w:val="24"/>
           <w:szCs w:val="24"/>
@@ -2639,7 +2709,6 @@
           <w:sz w:val="24"/>
           <w:szCs w:val="24"/>
         </w:rPr>
-        <w:lastRenderedPageBreak/>
         <w:t>Procedure</w:t>
       </w:r>
     </w:p>
@@ -2894,33 +2963,6 @@
           <w:szCs w:val="22"/>
         </w:rPr>
         <w:t>.</w:t>
-      </w:r>
-      <w:r>
-        <w:rPr>
-          <w:iCs/>
-          <w:color w:val="auto"/>
-          <w:sz w:val="22"/>
-          <w:szCs w:val="22"/>
-        </w:rPr>
-        <w:t xml:space="preserve"> </w:t>
-      </w:r>
-      <w:r>
-        <w:rPr>
-          <w:iCs/>
-          <w:color w:val="auto"/>
-          <w:sz w:val="22"/>
-          <w:szCs w:val="22"/>
-        </w:rPr>
-        <w:t xml:space="preserve">Table captions also have a title in bold followed by more details. Table captions go above the table itself. Tables themselves are center-aligned following APA guidelines. There are no visible boundaries, except for a horizontal line between header and first row, and below the last row. Number the rows if you need to refer to individual rows in the text. Write out abbreviations in full. </w:t>
-      </w:r>
-      <w:r>
-        <w:rPr>
-          <w:iCs/>
-          <w:color w:val="auto"/>
-          <w:sz w:val="22"/>
-          <w:szCs w:val="22"/>
-        </w:rPr>
-        <w:t>TSR = Token Sort Ratio.</w:t>
       </w:r>
     </w:p>
     <w:tbl>
@@ -3421,6 +3463,34 @@
           <w:szCs w:val="24"/>
         </w:rPr>
       </w:pPr>
+      <w:r>
+        <w:rPr>
+          <w:i/>
+          <w:iCs/>
+          <w:color w:val="000000" w:themeColor="text1"/>
+          <w:sz w:val="24"/>
+          <w:szCs w:val="24"/>
+        </w:rPr>
+        <w:t xml:space="preserve">Note. </w:t>
+      </w:r>
+      <w:r>
+        <w:rPr>
+          <w:iCs/>
+          <w:color w:val="auto"/>
+          <w:sz w:val="22"/>
+          <w:szCs w:val="22"/>
+        </w:rPr>
+        <w:t xml:space="preserve">Tables are center-aligned following APA guidelines. There are no visible boundaries, except for a horizontal line between header and first row, and below the last row. Number the rows if you need to refer to individual rows in the text. Write out abbreviations in full. </w:t>
+      </w:r>
+      <w:r>
+        <w:rPr>
+          <w:iCs/>
+          <w:color w:val="auto"/>
+          <w:sz w:val="22"/>
+          <w:szCs w:val="22"/>
+        </w:rPr>
+        <w:t>TSR = Token Sort Ratio.</w:t>
+      </w:r>
     </w:p>
     <w:p>
       <w:pPr>
@@ -3691,6 +3761,7 @@
     <w:p>
       <w:pPr>
         <w:spacing w:line="480" w:lineRule="auto"/>
+        <w:ind w:firstLine="238"/>
         <w:jc w:val="both"/>
         <w:rPr>
           <w:color w:val="auto"/>
@@ -3698,6 +3769,109 @@
           <w:szCs w:val="24"/>
         </w:rPr>
       </w:pPr>
+    </w:p>
+    <w:p>
+      <w:pPr>
+        <w:spacing w:line="480" w:lineRule="auto"/>
+        <w:jc w:val="both"/>
+        <w:rPr>
+          <w:color w:val="auto"/>
+          <w:sz w:val="24"/>
+          <w:szCs w:val="24"/>
+        </w:rPr>
+      </w:pPr>
+      <w:bookmarkStart w:id="15" w:name="_Ref516054711"/>
+      <w:bookmarkStart w:id="16" w:name="_Toc516054616"/>
+      <w:r>
+        <w:rPr>
+          <w:b/>
+          <w:color w:val="auto"/>
+          <w:sz w:val="22"/>
+          <w:szCs w:val="24"/>
+          <w:lang w:val="en-GB"/>
+        </w:rPr>
+        <w:t xml:space="preserve">Figure </w:t>
+      </w:r>
+      <w:r>
+        <w:rPr>
+          <w:b/>
+          <w:color w:val="auto"/>
+          <w:sz w:val="22"/>
+          <w:szCs w:val="24"/>
+          <w:lang w:val="en-GB"/>
+        </w:rPr>
+        <w:fldChar w:fldCharType="begin"/>
+      </w:r>
+      <w:r>
+        <w:rPr>
+          <w:b/>
+          <w:color w:val="auto"/>
+          <w:sz w:val="22"/>
+          <w:szCs w:val="24"/>
+          <w:lang w:val="en-GB"/>
+        </w:rPr>
+        <w:instrText xml:space="preserve"> SEQ Figure \* ARABIC </w:instrText>
+      </w:r>
+      <w:r>
+        <w:rPr>
+          <w:b/>
+          <w:color w:val="auto"/>
+          <w:sz w:val="22"/>
+          <w:szCs w:val="24"/>
+          <w:lang w:val="en-GB"/>
+        </w:rPr>
+        <w:fldChar w:fldCharType="separate"/>
+      </w:r>
+      <w:r>
+        <w:rPr>
+          <w:b/>
+          <w:noProof/>
+          <w:color w:val="auto"/>
+          <w:sz w:val="22"/>
+          <w:szCs w:val="24"/>
+          <w:lang w:val="en-GB"/>
+        </w:rPr>
+        <w:t>2</w:t>
+      </w:r>
+      <w:r>
+        <w:rPr>
+          <w:color w:val="auto"/>
+          <w:sz w:val="22"/>
+          <w:szCs w:val="24"/>
+        </w:rPr>
+        <w:fldChar w:fldCharType="end"/>
+      </w:r>
+      <w:bookmarkEnd w:id="15"/>
+      <w:r>
+        <w:rPr>
+          <w:b/>
+          <w:color w:val="auto"/>
+          <w:sz w:val="22"/>
+          <w:szCs w:val="24"/>
+          <w:lang w:val="en-GB"/>
+        </w:rPr>
+        <w:t xml:space="preserve">. </w:t>
+      </w:r>
+      <w:bookmarkEnd w:id="16"/>
+      <w:r>
+        <w:rPr>
+          <w:b/>
+          <w:color w:val="auto"/>
+          <w:sz w:val="22"/>
+          <w:szCs w:val="24"/>
+          <w:lang w:val="en-GB"/>
+        </w:rPr>
+        <w:t>My factor of interest, manipulated in Experiment 1, influences speech perception</w:t>
+      </w:r>
+      <w:r>
+        <w:rPr>
+          <w:b/>
+          <w:color w:val="auto"/>
+          <w:sz w:val="22"/>
+          <w:szCs w:val="24"/>
+        </w:rPr>
+        <w:t>.</w:t>
+      </w:r>
     </w:p>
     <w:p>
       <w:pPr>
@@ -3770,7 +3944,6 @@
     <w:p>
       <w:pPr>
         <w:spacing w:line="480" w:lineRule="auto"/>
-        <w:ind w:firstLine="238"/>
         <w:jc w:val="both"/>
         <w:rPr>
           <w:i/>
@@ -3779,60 +3952,49 @@
           <w:szCs w:val="24"/>
         </w:rPr>
       </w:pPr>
-      <w:bookmarkStart w:id="15" w:name="_Ref516054711"/>
-      <w:bookmarkStart w:id="16" w:name="_Toc516054616"/>
       <w:bookmarkStart w:id="17" w:name="_Toc34056606"/>
       <w:bookmarkStart w:id="18" w:name="_Toc109469369"/>
       <w:r>
         <w:rPr>
-          <w:b/>
+          <w:i/>
+          <w:iCs/>
           <w:color w:val="auto"/>
           <w:sz w:val="22"/>
           <w:szCs w:val="24"/>
-          <w:lang w:val="en-GB"/>
-        </w:rPr>
-        <w:t xml:space="preserve">Figure </w:t>
-      </w:r>
-      <w:r>
-        <w:rPr>
-          <w:b/>
+        </w:rPr>
+        <w:t xml:space="preserve">Note. </w:t>
+      </w:r>
+      <w:r>
+        <w:rPr>
           <w:color w:val="auto"/>
           <w:sz w:val="22"/>
           <w:szCs w:val="24"/>
-          <w:lang w:val="en-GB"/>
-        </w:rPr>
-        <w:fldChar w:fldCharType="begin"/>
-      </w:r>
-      <w:r>
-        <w:rPr>
-          <w:b/>
+        </w:rPr>
+        <w:t xml:space="preserve">The figure </w:t>
+      </w:r>
+      <w:r>
+        <w:rPr>
           <w:color w:val="auto"/>
           <w:sz w:val="22"/>
           <w:szCs w:val="24"/>
-          <w:lang w:val="en-GB"/>
-        </w:rPr>
-        <w:instrText xml:space="preserve"> SEQ Figure \* ARABIC </w:instrText>
-      </w:r>
-      <w:r>
-        <w:rPr>
-          <w:b/>
+        </w:rPr>
+        <w:t xml:space="preserve">title </w:t>
+      </w:r>
+      <w:r>
+        <w:rPr>
           <w:color w:val="auto"/>
           <w:sz w:val="22"/>
           <w:szCs w:val="24"/>
-          <w:lang w:val="en-GB"/>
-        </w:rPr>
-        <w:fldChar w:fldCharType="separate"/>
-      </w:r>
-      <w:r>
-        <w:rPr>
-          <w:b/>
-          <w:noProof/>
+        </w:rPr>
+        <w:t xml:space="preserve">ideally </w:t>
+      </w:r>
+      <w:r>
+        <w:rPr>
           <w:color w:val="auto"/>
           <w:sz w:val="22"/>
           <w:szCs w:val="24"/>
-          <w:lang w:val="en-GB"/>
-        </w:rPr>
-        <w:t>2</w:t>
+        </w:rPr>
+        <w:t xml:space="preserve">forms a full sentence with a verb, describing the main outcome. Also include </w:t>
       </w:r>
       <w:r>
         <w:rPr>
@@ -3840,38 +4002,31 @@
           <w:sz w:val="22"/>
           <w:szCs w:val="24"/>
         </w:rPr>
-        <w:fldChar w:fldCharType="end"/>
-      </w:r>
-      <w:bookmarkEnd w:id="15"/>
-      <w:r>
-        <w:rPr>
-          <w:b/>
+        <w:t xml:space="preserve">in the title </w:t>
+      </w:r>
+      <w:r>
+        <w:rPr>
           <w:color w:val="auto"/>
           <w:sz w:val="22"/>
           <w:szCs w:val="24"/>
-          <w:lang w:val="en-GB"/>
-        </w:rPr>
-        <w:t xml:space="preserve">. </w:t>
-      </w:r>
-      <w:bookmarkEnd w:id="16"/>
-      <w:r>
-        <w:rPr>
-          <w:b/>
+        </w:rPr>
+        <w:t xml:space="preserve">which experiment this figure belongs to, for readers who lost track of which figure went with which experiment. </w:t>
+      </w:r>
+      <w:r>
+        <w:rPr>
           <w:color w:val="auto"/>
           <w:sz w:val="22"/>
           <w:szCs w:val="24"/>
-          <w:lang w:val="en-GB"/>
-        </w:rPr>
-        <w:t>My factor of interest, manipulated in Experiment 1, influences speech perception</w:t>
-      </w:r>
-      <w:r>
-        <w:rPr>
-          <w:b/>
+        </w:rPr>
+        <w:t>The note, below the figure, should give r</w:t>
+      </w:r>
+      <w:r>
+        <w:rPr>
           <w:color w:val="auto"/>
           <w:sz w:val="22"/>
           <w:szCs w:val="24"/>
         </w:rPr>
-        <w:t>.</w:t>
+        <w:t xml:space="preserve">eaders </w:t>
       </w:r>
       <w:r>
         <w:rPr>
@@ -3879,7 +4034,47 @@
           <w:sz w:val="22"/>
           <w:szCs w:val="24"/>
         </w:rPr>
-        <w:t xml:space="preserve"> Use a caption title that forms a full sentence with a verb, describing the main outcome. Also include which experiment this figure belongs to, for readers who lost track of which figure went with which experiment. Ideally, readers should be able to understand the study design and outcomes by scanning the figures and captions alone. Include descriptive statements to take readers by the hand, such as “Condition 1 (blue) showed a higher proportion of /s/ responses (red) compared to Condition 2, suggesting that my factor of interest biased perception towards /s/”</w:t>
+        <w:t xml:space="preserve">all the information </w:t>
+      </w:r>
+      <w:r>
+        <w:rPr>
+          <w:color w:val="auto"/>
+          <w:sz w:val="22"/>
+          <w:szCs w:val="24"/>
+        </w:rPr>
+        <w:t>to understand the study design and outcomes</w:t>
+      </w:r>
+      <w:r>
+        <w:rPr>
+          <w:color w:val="auto"/>
+          <w:sz w:val="22"/>
+          <w:szCs w:val="24"/>
+        </w:rPr>
+        <w:t>: a long caption</w:t>
+      </w:r>
+      <w:r>
+        <w:rPr>
+          <w:color w:val="auto"/>
+          <w:sz w:val="22"/>
+          <w:szCs w:val="24"/>
+        </w:rPr>
+        <w:t xml:space="preserve">. Include </w:t>
+      </w:r>
+      <w:r>
+        <w:rPr>
+          <w:color w:val="auto"/>
+          <w:sz w:val="22"/>
+          <w:szCs w:val="24"/>
+        </w:rPr>
+        <w:t>important take-away messages</w:t>
+      </w:r>
+      <w:r>
+        <w:rPr>
+          <w:color w:val="auto"/>
+          <w:sz w:val="22"/>
+          <w:szCs w:val="24"/>
+        </w:rPr>
+        <w:t xml:space="preserve"> to take readers by the hand, such as “Condition 1 (blue) showed a higher proportion of /s/ responses (red) compared to Condition 2, suggesting that my factor of interest biased perception towards /s/”</w:t>
       </w:r>
       <w:r>
         <w:rPr>
@@ -4061,61 +4256,60 @@
           <w:sz w:val="24"/>
           <w:szCs w:val="24"/>
         </w:rPr>
-        <w:t xml:space="preserve">(GLMM; Quené &amp; </w:t>
-      </w:r>
-      <w:r>
-        <w:rPr>
-          <w:sz w:val="24"/>
-          <w:szCs w:val="24"/>
+        <w:t>(GLMM; Quené &amp; Van den Bergh, 2008)</w:t>
+      </w:r>
+      <w:r>
+        <w:rPr>
+          <w:color w:val="auto"/>
+          <w:sz w:val="24"/>
+          <w:szCs w:val="24"/>
+        </w:rPr>
+        <w:fldChar w:fldCharType="end"/>
+      </w:r>
+      <w:r>
+        <w:rPr>
+          <w:color w:val="auto"/>
+          <w:sz w:val="24"/>
+          <w:szCs w:val="24"/>
+        </w:rPr>
+        <w:t xml:space="preserve"> with a logistic linking function as implemented in the lme4 library </w:t>
+      </w:r>
+      <w:r>
+        <w:rPr>
+          <w:color w:val="auto"/>
+          <w:sz w:val="24"/>
+          <w:szCs w:val="24"/>
+        </w:rPr>
+        <w:fldChar w:fldCharType="begin"/>
+      </w:r>
+      <w:r>
+        <w:rPr>
+          <w:color w:val="auto"/>
+          <w:sz w:val="24"/>
+          <w:szCs w:val="24"/>
+        </w:rPr>
+        <w:instrText xml:space="preserve"> ADDIN ZOTERO_ITEM CSL_CITATION {"citationID":"8f1Z9tdP","properties":{"formattedCitation":"(version 1.1-30; Bates et al., 2015)","plainCitation":"(version 1.1-30; Bates et al., 2015)","noteIndex":0},"citationItems":[{"id":249,"uris":["http://zotero.org/users/4895952/items/VDS8QZZR"],"itemData":{"id":249,"type":"article-journal","container-title":"Journal of Statistical Software","DOI":"doi:10.18637/jss.v067.i01","page":"1-48","title":"Fitting linear mixed-effects models using lme4","volume":"67","author":[{"family":"Bates","given":"Douglas"},{"family":"Maechler","given":"Martin"},{"family":"Bolker","given":"Ben"},{"family":"Walker","given":"Steve"}],"issued":{"date-parts":[["2015"]]}},"prefix":"version 1.1-30;"}],"schema":"https://github.com/citation-style-language/schema/raw/master/csl-citation.json"} </w:instrText>
+      </w:r>
+      <w:r>
+        <w:rPr>
+          <w:color w:val="auto"/>
+          <w:sz w:val="24"/>
+          <w:szCs w:val="24"/>
+        </w:rPr>
+        <w:fldChar w:fldCharType="separate"/>
+      </w:r>
+      <w:r>
+        <w:rPr>
+          <w:sz w:val="24"/>
+        </w:rPr>
+        <w:t xml:space="preserve">(version </w:t>
+      </w:r>
+      <w:r>
+        <w:rPr>
+          <w:sz w:val="24"/>
         </w:rPr>
         <w:lastRenderedPageBreak/>
-        <w:t>Van den Bergh, 2008)</w:t>
-      </w:r>
-      <w:r>
-        <w:rPr>
-          <w:color w:val="auto"/>
-          <w:sz w:val="24"/>
-          <w:szCs w:val="24"/>
-        </w:rPr>
-        <w:fldChar w:fldCharType="end"/>
-      </w:r>
-      <w:r>
-        <w:rPr>
-          <w:color w:val="auto"/>
-          <w:sz w:val="24"/>
-          <w:szCs w:val="24"/>
-        </w:rPr>
-        <w:t xml:space="preserve"> with a logistic linking function as implemented in the lme4 library </w:t>
-      </w:r>
-      <w:r>
-        <w:rPr>
-          <w:color w:val="auto"/>
-          <w:sz w:val="24"/>
-          <w:szCs w:val="24"/>
-        </w:rPr>
-        <w:fldChar w:fldCharType="begin"/>
-      </w:r>
-      <w:r>
-        <w:rPr>
-          <w:color w:val="auto"/>
-          <w:sz w:val="24"/>
-          <w:szCs w:val="24"/>
-        </w:rPr>
-        <w:instrText xml:space="preserve"> ADDIN ZOTERO_ITEM CSL_CITATION {"citationID":"8f1Z9tdP","properties":{"formattedCitation":"(version 1.1-30; Bates et al., 2015)","plainCitation":"(version 1.1-30; Bates et al., 2015)","noteIndex":0},"citationItems":[{"id":249,"uris":["http://zotero.org/users/4895952/items/VDS8QZZR"],"itemData":{"id":249,"type":"article-journal","container-title":"Journal of Statistical Software","DOI":"doi:10.18637/jss.v067.i01","page":"1-48","title":"Fitting linear mixed-effects models using lme4","volume":"67","author":[{"family":"Bates","given":"Douglas"},{"family":"Maechler","given":"Martin"},{"family":"Bolker","given":"Ben"},{"family":"Walker","given":"Steve"}],"issued":{"date-parts":[["2015"]]}},"prefix":"version 1.1-30;"}],"schema":"https://github.com/citation-style-language/schema/raw/master/csl-citation.json"} </w:instrText>
-      </w:r>
-      <w:r>
-        <w:rPr>
-          <w:color w:val="auto"/>
-          <w:sz w:val="24"/>
-          <w:szCs w:val="24"/>
-        </w:rPr>
-        <w:fldChar w:fldCharType="separate"/>
-      </w:r>
-      <w:r>
-        <w:rPr>
-          <w:sz w:val="24"/>
-        </w:rPr>
-        <w:t>(version 1.1-30; Bates et al., 2015)</w:t>
+        <w:t>1.1-30; Bates et al., 2015)</w:t>
       </w:r>
       <w:r>
         <w:rPr>
@@ -4877,7 +5071,6 @@
           <w:sz w:val="24"/>
           <w:szCs w:val="24"/>
         </w:rPr>
-        <w:lastRenderedPageBreak/>
         <w:t>Method</w:t>
       </w:r>
     </w:p>
@@ -4975,7 +5168,16 @@
           <w:sz w:val="24"/>
           <w:szCs w:val="24"/>
         </w:rPr>
-        <w:t># males; mean age = #</w:t>
+        <w:t xml:space="preserve"># males; </w:t>
+      </w:r>
+      <w:r>
+        <w:rPr>
+          <w:color w:val="auto"/>
+          <w:sz w:val="24"/>
+          <w:szCs w:val="24"/>
+        </w:rPr>
+        <w:lastRenderedPageBreak/>
+        <w:t>mean age = #</w:t>
       </w:r>
       <w:r>
         <w:rPr>
@@ -5410,6 +5612,7 @@
     <w:p>
       <w:pPr>
         <w:spacing w:line="480" w:lineRule="auto"/>
+        <w:ind w:firstLine="238"/>
         <w:jc w:val="both"/>
         <w:rPr>
           <w:color w:val="auto"/>
@@ -5417,6 +5620,116 @@
           <w:szCs w:val="24"/>
         </w:rPr>
       </w:pPr>
+    </w:p>
+    <w:p>
+      <w:pPr>
+        <w:spacing w:line="480" w:lineRule="auto"/>
+        <w:jc w:val="both"/>
+        <w:rPr>
+          <w:color w:val="auto"/>
+          <w:sz w:val="24"/>
+          <w:szCs w:val="24"/>
+        </w:rPr>
+      </w:pPr>
+      <w:bookmarkStart w:id="19" w:name="_Ref38276318"/>
+      <w:r>
+        <w:rPr>
+          <w:b/>
+          <w:color w:val="auto"/>
+          <w:sz w:val="22"/>
+          <w:szCs w:val="24"/>
+          <w:lang w:val="en-GB"/>
+        </w:rPr>
+        <w:t xml:space="preserve">Figure </w:t>
+      </w:r>
+      <w:r>
+        <w:rPr>
+          <w:b/>
+          <w:color w:val="auto"/>
+          <w:sz w:val="22"/>
+          <w:szCs w:val="24"/>
+          <w:lang w:val="en-GB"/>
+        </w:rPr>
+        <w:fldChar w:fldCharType="begin"/>
+      </w:r>
+      <w:r>
+        <w:rPr>
+          <w:b/>
+          <w:color w:val="auto"/>
+          <w:sz w:val="22"/>
+          <w:szCs w:val="24"/>
+          <w:lang w:val="en-GB"/>
+        </w:rPr>
+        <w:instrText xml:space="preserve"> SEQ Figure \* ARABIC </w:instrText>
+      </w:r>
+      <w:r>
+        <w:rPr>
+          <w:b/>
+          <w:color w:val="auto"/>
+          <w:sz w:val="22"/>
+          <w:szCs w:val="24"/>
+          <w:lang w:val="en-GB"/>
+        </w:rPr>
+        <w:fldChar w:fldCharType="separate"/>
+      </w:r>
+      <w:r>
+        <w:rPr>
+          <w:b/>
+          <w:noProof/>
+          <w:color w:val="auto"/>
+          <w:sz w:val="22"/>
+          <w:szCs w:val="24"/>
+          <w:lang w:val="en-GB"/>
+        </w:rPr>
+        <w:t>3</w:t>
+      </w:r>
+      <w:r>
+        <w:rPr>
+          <w:color w:val="auto"/>
+          <w:sz w:val="22"/>
+          <w:szCs w:val="24"/>
+        </w:rPr>
+        <w:fldChar w:fldCharType="end"/>
+      </w:r>
+      <w:bookmarkEnd w:id="19"/>
+      <w:r>
+        <w:rPr>
+          <w:b/>
+          <w:color w:val="auto"/>
+          <w:sz w:val="22"/>
+          <w:szCs w:val="24"/>
+          <w:lang w:val="en-GB"/>
+        </w:rPr>
+        <w:t xml:space="preserve">. </w:t>
+      </w:r>
+      <w:r>
+        <w:rPr>
+          <w:b/>
+          <w:color w:val="auto"/>
+          <w:sz w:val="22"/>
+          <w:szCs w:val="24"/>
+        </w:rPr>
+        <w:t xml:space="preserve">Another </w:t>
+      </w:r>
+      <w:r>
+        <w:rPr>
+          <w:b/>
+          <w:color w:val="auto"/>
+          <w:sz w:val="22"/>
+          <w:szCs w:val="24"/>
+          <w:lang w:val="en-GB"/>
+        </w:rPr>
+        <w:t>factor of interest, manipulated in Experiment 2, influences speech perception</w:t>
+      </w:r>
+      <w:r>
+        <w:rPr>
+          <w:b/>
+          <w:color w:val="auto"/>
+          <w:sz w:val="22"/>
+          <w:szCs w:val="24"/>
+        </w:rPr>
+        <w:t>.</w:t>
+      </w:r>
     </w:p>
     <w:p>
       <w:pPr>
@@ -5436,7 +5749,6 @@
           <w:sz w:val="24"/>
           <w:szCs w:val="24"/>
         </w:rPr>
-        <w:lastRenderedPageBreak/>
         <w:drawing>
           <wp:inline distT="0" distB="0" distL="0" distR="0" wp14:anchorId="508F23B8" wp14:editId="1E5A396A">
             <wp:extent cx="3206750" cy="3202834"/>
@@ -5499,58 +5811,48 @@
           <w:szCs w:val="24"/>
         </w:rPr>
       </w:pPr>
-      <w:bookmarkStart w:id="19" w:name="_Ref38276318"/>
       <w:bookmarkStart w:id="20" w:name="_Toc109469370"/>
       <w:r>
         <w:rPr>
-          <w:b/>
+          <w:i/>
+          <w:iCs/>
           <w:color w:val="auto"/>
           <w:sz w:val="22"/>
           <w:szCs w:val="24"/>
-          <w:lang w:val="en-GB"/>
-        </w:rPr>
-        <w:t xml:space="preserve">Figure </w:t>
-      </w:r>
-      <w:r>
-        <w:rPr>
-          <w:b/>
+        </w:rPr>
+        <w:t>Note.</w:t>
+      </w:r>
+      <w:r>
+        <w:rPr>
           <w:color w:val="auto"/>
           <w:sz w:val="22"/>
           <w:szCs w:val="24"/>
-          <w:lang w:val="en-GB"/>
-        </w:rPr>
-        <w:fldChar w:fldCharType="begin"/>
-      </w:r>
-      <w:r>
-        <w:rPr>
-          <w:b/>
+        </w:rPr>
+        <w:t xml:space="preserve"> I</w:t>
+      </w:r>
+      <w:r>
+        <w:rPr>
           <w:color w:val="auto"/>
           <w:sz w:val="22"/>
           <w:szCs w:val="24"/>
-          <w:lang w:val="en-GB"/>
-        </w:rPr>
-        <w:instrText xml:space="preserve"> SEQ Figure \* ARABIC </w:instrText>
-      </w:r>
-      <w:r>
-        <w:rPr>
-          <w:b/>
+        </w:rPr>
+        <w:t>nclude all details about the figure</w:t>
+      </w:r>
+      <w:r>
+        <w:rPr>
           <w:color w:val="auto"/>
           <w:sz w:val="22"/>
           <w:szCs w:val="24"/>
-          <w:lang w:val="en-GB"/>
-        </w:rPr>
-        <w:fldChar w:fldCharType="separate"/>
-      </w:r>
-      <w:r>
-        <w:rPr>
-          <w:b/>
-          <w:noProof/>
+        </w:rPr>
+        <w:t>,</w:t>
+      </w:r>
+      <w:r>
+        <w:rPr>
           <w:color w:val="auto"/>
           <w:sz w:val="22"/>
           <w:szCs w:val="24"/>
-          <w:lang w:val="en-GB"/>
-        </w:rPr>
-        <w:t>3</w:t>
+        </w:rPr>
+        <w:t xml:space="preserve"> and its </w:t>
       </w:r>
       <w:r>
         <w:rPr>
@@ -5558,54 +5860,15 @@
           <w:sz w:val="22"/>
           <w:szCs w:val="24"/>
         </w:rPr>
-        <w:fldChar w:fldCharType="end"/>
-      </w:r>
-      <w:bookmarkEnd w:id="19"/>
-      <w:r>
-        <w:rPr>
-          <w:b/>
+        <w:t>take-home message,</w:t>
+      </w:r>
+      <w:r>
+        <w:rPr>
           <w:color w:val="auto"/>
           <w:sz w:val="22"/>
           <w:szCs w:val="24"/>
-          <w:lang w:val="en-GB"/>
-        </w:rPr>
-        <w:t xml:space="preserve">. </w:t>
-      </w:r>
-      <w:r>
-        <w:rPr>
-          <w:b/>
-          <w:color w:val="auto"/>
-          <w:sz w:val="22"/>
-          <w:szCs w:val="24"/>
-        </w:rPr>
-        <w:t xml:space="preserve">Another </w:t>
-      </w:r>
-      <w:r>
-        <w:rPr>
-          <w:b/>
-          <w:color w:val="auto"/>
-          <w:sz w:val="22"/>
-          <w:szCs w:val="24"/>
-          <w:lang w:val="en-GB"/>
-        </w:rPr>
-        <w:t>factor of interest, manipulated in Experiment 2, influences speech perception</w:t>
-      </w:r>
-      <w:r>
-        <w:rPr>
-          <w:b/>
-          <w:color w:val="auto"/>
-          <w:sz w:val="22"/>
-          <w:szCs w:val="24"/>
-        </w:rPr>
-        <w:t>.</w:t>
-      </w:r>
-      <w:r>
-        <w:rPr>
-          <w:color w:val="auto"/>
-          <w:sz w:val="22"/>
-          <w:szCs w:val="24"/>
-        </w:rPr>
-        <w:t xml:space="preserve"> Include all details about the figure and its implications in a long caption</w:t>
+        </w:rPr>
+        <w:t xml:space="preserve"> in a long caption</w:t>
       </w:r>
       <w:r>
         <w:rPr>
@@ -6093,7 +6356,6 @@
           <w:sz w:val="24"/>
           <w:szCs w:val="22"/>
         </w:rPr>
-        <w:lastRenderedPageBreak/>
         <w:t>G</w:t>
       </w:r>
       <w:r>
@@ -6338,6 +6600,7 @@
           <w:sz w:val="24"/>
           <w:szCs w:val="22"/>
         </w:rPr>
+        <w:lastRenderedPageBreak/>
         <w:t>DISCLOSURE OF AI USE</w:t>
       </w:r>
     </w:p>
@@ -6678,7 +6941,6 @@
           <w:sz w:val="24"/>
           <w:szCs w:val="22"/>
         </w:rPr>
-        <w:lastRenderedPageBreak/>
         <w:t xml:space="preserve">for </w:t>
       </w:r>
       <w:r>
@@ -7147,7 +7409,7 @@
       </w:r>
     </w:p>
   </w:comment>
-  <w:comment w:id="12" w:author="Hans Rutger Bosker" w:date="2022-07-25T12:43:00Z" w:initials="HRB">
+  <w:comment w:id="11" w:author="Hans Rutger Bosker" w:date="2022-07-25T12:43:00Z" w:initials="HRB">
     <w:p>
       <w:pPr>
         <w:pStyle w:val="CommentText"/>
@@ -7176,7 +7438,7 @@
   <w15:commentEx w15:paraId="75938264" w15:done="0"/>
   <w15:commentEx w15:paraId="35240981" w15:done="0"/>
   <w15:commentEx w15:paraId="7BE7A412" w15:done="0"/>
-  <w15:commentEx w15:paraId="13C70079" w15:done="0"/>
+  <w15:commentEx w15:paraId="2ABB600D" w15:done="0"/>
 </w15:commentsEx>
 </file>
 
@@ -7190,7 +7452,7 @@
   <w16cid:commentId w16cid:paraId="75938264" w16cid:durableId="2A841FF6"/>
   <w16cid:commentId w16cid:paraId="35240981" w16cid:durableId="2A841FF7"/>
   <w16cid:commentId w16cid:paraId="7BE7A412" w16cid:durableId="2A841FF8"/>
-  <w16cid:commentId w16cid:paraId="13C70079" w16cid:durableId="2A841FF9"/>
+  <w16cid:commentId w16cid:paraId="2ABB600D" w16cid:durableId="2A841FF9"/>
 </w16cid:commentsIds>
 </file>
 
@@ -12115,6 +12377,7 @@
   <w:style w:type="character" w:default="1" w:styleId="DefaultParagraphFont">
     <w:name w:val="Default Paragraph Font"/>
     <w:uiPriority w:val="1"/>
+    <w:semiHidden/>
     <w:unhideWhenUsed/>
   </w:style>
   <w:style w:type="table" w:default="1" w:styleId="TableNormal">

</xml_diff>